<commit_message>
docs: agregar enlace del repositorio a la portada AE2
</commit_message>
<xml_diff>
--- a/docs/Tarnoski Santiago_Actividad Evaluativa 2.docx
+++ b/docs/Tarnoski Santiago_Actividad Evaluativa 2.docx
@@ -145,6 +145,26 @@
       <w:r>
         <w:t>28-09-2026</w:t>
       </w:r>
+    </w:p>
+    <w:p>
+      <w:pPr>
+        <w:spacing w:after="120"/>
+      </w:pPr>
+      <w:r>
+        <w:rPr>
+          <w:b/>
+        </w:rPr>
+        <w:t xml:space="preserve">REPOSITORIO: </w:t>
+      </w:r>
+      <w:hyperlink r:id="rId10">
+        <w:r>
+          <w:rPr>
+            <w:color w:val="274C8A"/>
+            <w:u w:val="single"/>
+          </w:rPr>
+          <w:t>https://github.com/santiagotarnoski/gym-control-ae1</w:t>
+        </w:r>
+      </w:hyperlink>
     </w:p>
     <w:p>
       <w:r>
@@ -1353,7 +1373,7 @@
                     <pic:cNvPicPr/>
                   </pic:nvPicPr>
                   <pic:blipFill>
-                    <a:blip r:embed="rId13"/>
+                    <a:blip r:embed="rId14"/>
                     <a:stretch>
                       <a:fillRect/>
                     </a:stretch>
@@ -1822,7 +1842,7 @@
                     <pic:cNvPicPr/>
                   </pic:nvPicPr>
                   <pic:blipFill>
-                    <a:blip r:embed="rId14"/>
+                    <a:blip r:embed="rId15"/>
                     <a:stretch>
                       <a:fillRect/>
                     </a:stretch>
@@ -1881,7 +1901,7 @@
                     <pic:cNvPicPr/>
                   </pic:nvPicPr>
                   <pic:blipFill>
-                    <a:blip r:embed="rId15"/>
+                    <a:blip r:embed="rId16"/>
                     <a:stretch>
                       <a:fillRect/>
                     </a:stretch>
@@ -1913,9 +1933,9 @@
       </w:r>
     </w:p>
     <w:sectPr>
-      <w:headerReference w:type="default" r:id="rId10"/>
-      <w:footerReference w:type="default" r:id="rId11"/>
-      <w:footerReference w:type="first" r:id="rId12"/>
+      <w:headerReference w:type="default" r:id="rId11"/>
+      <w:footerReference w:type="default" r:id="rId12"/>
+      <w:footerReference w:type="first" r:id="rId13"/>
       <w:pgSz w:w="11909" w:h="16834"/>
       <w:pgMar w:top="1800" w:right="1440" w:bottom="1296" w:left="1440" w:header="504" w:footer="504" w:gutter="0"/>
       <w:cols w:space="720"/>

</xml_diff>